<commit_message>
Add settings and reports module
</commit_message>
<xml_diff>
--- a/src/templates/cert/cert_business_renteal_template.docx
+++ b/src/templates/cert/cert_business_renteal_template.docx
@@ -66,28 +66,30 @@
                           <w:p>
                             <w:pPr>
                               <w:rPr>
-                                <w:rFonts w:hint="default" w:ascii="Times New Roman" w:hAnsi="Times New Roman" w:eastAsia="宋体" w:cs="Times New Roman"/>
-                                <w:color w:val="E7E6E6" w:themeColor="background2"/>
+                                <w:rFonts w:hint="default"/>
                                 <w:lang w:val="en-US" w:eastAsia="zh-CN"/>
+                              </w:rPr>
+                            </w:pPr>
+                            <w:r>
+                              <w:rPr>
+                                <w:rFonts w:hint="eastAsia" w:ascii="Times New Roman" w:hAnsi="Times New Roman" w:eastAsia="TH Sarabun PSK" w:cs="Times New Roman"/>
+                                <w:b w:val="0"/>
+                                <w:bCs w:val="0"/>
+                                <w:i w:val="0"/>
+                                <w:iCs w:val="0"/>
+                                <w:color w:val="FFFFFF" w:themeColor="background1"/>
+                                <w:kern w:val="0"/>
+                                <w:sz w:val="28"/>
+                                <w:szCs w:val="28"/>
+                                <w:u w:val="none"/>
+                                <w:lang w:val="en-US" w:eastAsia="zh-CN" w:bidi="ar"/>
                                 <w14:textFill>
                                   <w14:solidFill>
-                                    <w14:schemeClr w14:val="bg2"/>
+                                    <w14:schemeClr w14:val="bg1"/>
                                   </w14:solidFill>
                                 </w14:textFill>
                               </w:rPr>
-                            </w:pPr>
-                            <w:r>
-                              <w:rPr>
-                                <w:rFonts w:hint="eastAsia" w:ascii="Times New Roman" w:hAnsi="Times New Roman" w:eastAsia="宋体" w:cs="Times New Roman"/>
-                                <w:color w:val="E7E6E6" w:themeColor="background2"/>
-                                <w:lang w:val="en-US" w:eastAsia="zh-CN"/>
-                                <w14:textFill>
-                                  <w14:solidFill>
-                                    <w14:schemeClr w14:val="bg2"/>
-                                  </w14:solidFill>
-                                </w14:textFill>
-                              </w:rPr>
-                              <w:t>{结束日期，格式yyyy-mm-dd}</w:t>
+                              <w:t>{endDate}</w:t>
                             </w:r>
                           </w:p>
                         </w:txbxContent>
@@ -113,28 +115,30 @@
                     <w:p>
                       <w:pPr>
                         <w:rPr>
-                          <w:rFonts w:hint="default" w:ascii="Times New Roman" w:hAnsi="Times New Roman" w:eastAsia="宋体" w:cs="Times New Roman"/>
-                          <w:color w:val="E7E6E6" w:themeColor="background2"/>
+                          <w:rFonts w:hint="default"/>
                           <w:lang w:val="en-US" w:eastAsia="zh-CN"/>
-                          <w14:textFill>
-                            <w14:solidFill>
-                              <w14:schemeClr w14:val="bg2"/>
-                            </w14:solidFill>
-                          </w14:textFill>
                         </w:rPr>
                       </w:pPr>
                       <w:r>
                         <w:rPr>
-                          <w:rFonts w:hint="eastAsia" w:ascii="Times New Roman" w:hAnsi="Times New Roman" w:eastAsia="宋体" w:cs="Times New Roman"/>
-                          <w:color w:val="E7E6E6" w:themeColor="background2"/>
-                          <w:lang w:val="en-US" w:eastAsia="zh-CN"/>
+                          <w:rFonts w:hint="eastAsia" w:ascii="Times New Roman" w:hAnsi="Times New Roman" w:eastAsia="TH Sarabun PSK" w:cs="Times New Roman"/>
+                          <w:b w:val="0"/>
+                          <w:bCs w:val="0"/>
+                          <w:i w:val="0"/>
+                          <w:iCs w:val="0"/>
+                          <w:color w:val="FFFFFF" w:themeColor="background1"/>
+                          <w:kern w:val="0"/>
+                          <w:sz w:val="28"/>
+                          <w:szCs w:val="28"/>
+                          <w:u w:val="none"/>
+                          <w:lang w:val="en-US" w:eastAsia="zh-CN" w:bidi="ar"/>
                           <w14:textFill>
                             <w14:solidFill>
-                              <w14:schemeClr w14:val="bg2"/>
+                              <w14:schemeClr w14:val="bg1"/>
                             </w14:solidFill>
                           </w14:textFill>
                         </w:rPr>
-                        <w:t>{结束日期，格式yyyy-mm-dd}</w:t>
+                        <w:t>{endDate}</w:t>
                       </w:r>
                     </w:p>
                   </w:txbxContent>
@@ -231,7 +235,7 @@
                                   </w14:solidFill>
                                 </w14:textFill>
                               </w:rPr>
-                              <w:t>{客户名称}</w:t>
+                              <w:t>{clientName}</w:t>
                             </w:r>
                           </w:p>
                           <w:p>
@@ -450,6 +454,7 @@
                                   <w:insideH w:val="none" w:color="auto" w:sz="0" w:space="0"/>
                                   <w:insideV w:val="none" w:color="auto" w:sz="0" w:space="0"/>
                                 </w:tblBorders>
+                                <w:shd w:val="clear" w:color="auto" w:fill="auto"/>
                                 <w:tblCellMar>
                                   <w:top w:w="0" w:type="dxa"/>
                                   <w:left w:w="108" w:type="dxa"/>
@@ -577,260 +582,6 @@
                                       </w14:textFill>
                                     </w:rPr>
                                     <w:t>e</w:t>
-                                  </w:r>
-                                </w:p>
-                              </w:tc>
-                            </w:tr>
-                            <w:tr>
-                              <w:tblPrEx>
-                                <w:tblBorders>
-                                  <w:top w:val="none" w:color="auto" w:sz="0" w:space="0"/>
-                                  <w:left w:val="none" w:color="auto" w:sz="0" w:space="0"/>
-                                  <w:bottom w:val="none" w:color="auto" w:sz="0" w:space="0"/>
-                                  <w:right w:val="none" w:color="auto" w:sz="0" w:space="0"/>
-                                  <w:insideH w:val="none" w:color="auto" w:sz="0" w:space="0"/>
-                                  <w:insideV w:val="none" w:color="auto" w:sz="0" w:space="0"/>
-                                </w:tblBorders>
-                                <w:tblCellMar>
-                                  <w:top w:w="0" w:type="dxa"/>
-                                  <w:left w:w="108" w:type="dxa"/>
-                                  <w:bottom w:w="0" w:type="dxa"/>
-                                  <w:right w:w="108" w:type="dxa"/>
-                                </w:tblCellMar>
-                              </w:tblPrEx>
-                              <w:trPr>
-                                <w:trHeight w:val="737" w:hRule="exact"/>
-                                <w:jc w:val="center"/>
-                              </w:trPr>
-                              <w:tc>
-                                <w:tcPr>
-                                  <w:tcW w:w="3146" w:type="dxa"/>
-                                  <w:shd w:val="clear" w:color="auto" w:fill="auto"/>
-                                  <w:noWrap/>
-                                  <w:vAlign w:val="center"/>
-                                </w:tcPr>
-                                <w:p>
-                                  <w:pPr>
-                                    <w:keepNext w:val="0"/>
-                                    <w:keepLines w:val="0"/>
-                                    <w:widowControl/>
-                                    <w:suppressLineNumbers w:val="0"/>
-                                    <w:jc w:val="left"/>
-                                    <w:textAlignment w:val="center"/>
-                                    <w:rPr>
-                                      <w:rFonts w:hint="default" w:ascii="Times New Roman" w:hAnsi="Times New Roman" w:eastAsia="TH Sarabun PSK" w:cs="Times New Roman"/>
-                                      <w:b/>
-                                      <w:bCs/>
-                                      <w:i w:val="0"/>
-                                      <w:iCs w:val="0"/>
-                                      <w:color w:val="BF9000" w:themeColor="accent4" w:themeShade="BF"/>
-                                      <w:sz w:val="32"/>
-                                      <w:szCs w:val="32"/>
-                                      <w:u w:val="none"/>
-                                      <w:lang w:val="en-US"/>
-                                    </w:rPr>
-                                  </w:pPr>
-                                  <w:r>
-                                    <w:rPr>
-                                      <w:rFonts w:hint="eastAsia" w:ascii="Times New Roman" w:hAnsi="Times New Roman" w:eastAsia="宋体" w:cs="Times New Roman"/>
-                                      <w:b/>
-                                      <w:bCs w:val="0"/>
-                                      <w:color w:val="EA9600"/>
-                                      <w:sz w:val="30"/>
-                                      <w:szCs w:val="22"/>
-                                      <w:lang w:val="en-US" w:eastAsia="zh-CN" w:bidi="ar-SA"/>
-                                    </w:rPr>
-                                    <w:t xml:space="preserve">Licensed Quantity: </w:t>
-                                  </w:r>
-                                </w:p>
-                              </w:tc>
-                              <w:tc>
-                                <w:tcPr>
-                                  <w:tcW w:w="5749" w:type="dxa"/>
-                                  <w:shd w:val="clear" w:color="auto" w:fill="auto"/>
-                                  <w:noWrap/>
-                                  <w:vAlign w:val="center"/>
-                                </w:tcPr>
-                                <w:p>
-                                  <w:pPr>
-                                    <w:keepNext w:val="0"/>
-                                    <w:keepLines w:val="0"/>
-                                    <w:widowControl/>
-                                    <w:suppressLineNumbers w:val="0"/>
-                                    <w:jc w:val="left"/>
-                                    <w:textAlignment w:val="center"/>
-                                    <w:rPr>
-                                      <w:rFonts w:hint="default" w:ascii="Times New Roman" w:hAnsi="Times New Roman" w:eastAsia="宋体" w:cs="Times New Roman"/>
-                                      <w:b w:val="0"/>
-                                      <w:bCs w:val="0"/>
-                                      <w:i w:val="0"/>
-                                      <w:iCs w:val="0"/>
-                                      <w:color w:val="FFFFFF" w:themeColor="background1"/>
-                                      <w:sz w:val="28"/>
-                                      <w:szCs w:val="28"/>
-                                      <w:u w:val="none"/>
-                                      <w:lang w:val="en-US" w:eastAsia="zh-CN"/>
-                                      <w14:textFill>
-                                        <w14:solidFill>
-                                          <w14:schemeClr w14:val="bg1"/>
-                                        </w14:solidFill>
-                                      </w14:textFill>
-                                    </w:rPr>
-                                  </w:pPr>
-                                  <w:r>
-                                    <w:rPr>
-                                      <w:rFonts w:hint="eastAsia" w:ascii="Times New Roman" w:hAnsi="Times New Roman" w:eastAsia="宋体" w:cs="Times New Roman"/>
-                                      <w:b w:val="0"/>
-                                      <w:bCs w:val="0"/>
-                                      <w:i w:val="0"/>
-                                      <w:iCs w:val="0"/>
-                                      <w:color w:val="FFFFFF" w:themeColor="background1"/>
-                                      <w:sz w:val="28"/>
-                                      <w:szCs w:val="28"/>
-                                      <w:u w:val="none"/>
-                                      <w:lang w:val="en-US" w:eastAsia="zh-CN"/>
-                                      <w14:textFill>
-                                        <w14:solidFill>
-                                          <w14:schemeClr w14:val="bg1"/>
-                                        </w14:solidFill>
-                                      </w14:textFill>
-                                    </w:rPr>
-                                    <w:t>{数量}</w:t>
-                                  </w:r>
-                                </w:p>
-                              </w:tc>
-                            </w:tr>
-                            <w:tr>
-                              <w:tblPrEx>
-                                <w:tblBorders>
-                                  <w:top w:val="none" w:color="auto" w:sz="0" w:space="0"/>
-                                  <w:left w:val="none" w:color="auto" w:sz="0" w:space="0"/>
-                                  <w:bottom w:val="none" w:color="auto" w:sz="0" w:space="0"/>
-                                  <w:right w:val="none" w:color="auto" w:sz="0" w:space="0"/>
-                                  <w:insideH w:val="none" w:color="auto" w:sz="0" w:space="0"/>
-                                  <w:insideV w:val="none" w:color="auto" w:sz="0" w:space="0"/>
-                                </w:tblBorders>
-                                <w:tblCellMar>
-                                  <w:top w:w="0" w:type="dxa"/>
-                                  <w:left w:w="108" w:type="dxa"/>
-                                  <w:bottom w:w="0" w:type="dxa"/>
-                                  <w:right w:w="108" w:type="dxa"/>
-                                </w:tblCellMar>
-                              </w:tblPrEx>
-                              <w:trPr>
-                                <w:trHeight w:val="737" w:hRule="exact"/>
-                                <w:jc w:val="center"/>
-                              </w:trPr>
-                              <w:tc>
-                                <w:tcPr>
-                                  <w:tcW w:w="3146" w:type="dxa"/>
-                                  <w:shd w:val="clear" w:color="auto" w:fill="auto"/>
-                                  <w:noWrap/>
-                                  <w:vAlign w:val="center"/>
-                                </w:tcPr>
-                                <w:p>
-                                  <w:pPr>
-                                    <w:keepNext w:val="0"/>
-                                    <w:keepLines w:val="0"/>
-                                    <w:widowControl/>
-                                    <w:suppressLineNumbers w:val="0"/>
-                                    <w:jc w:val="left"/>
-                                    <w:textAlignment w:val="center"/>
-                                    <w:rPr>
-                                      <w:rFonts w:hint="default" w:ascii="Times New Roman" w:hAnsi="Times New Roman" w:eastAsia="TH Sarabun PSK" w:cs="Times New Roman"/>
-                                      <w:b/>
-                                      <w:bCs/>
-                                      <w:i w:val="0"/>
-                                      <w:iCs w:val="0"/>
-                                      <w:color w:val="BF9000" w:themeColor="accent4" w:themeShade="BF"/>
-                                      <w:sz w:val="32"/>
-                                      <w:szCs w:val="32"/>
-                                      <w:u w:val="none"/>
-                                    </w:rPr>
-                                  </w:pPr>
-                                  <w:r>
-                                    <w:rPr>
-                                      <w:rFonts w:hint="eastAsia" w:ascii="Times New Roman" w:hAnsi="Times New Roman" w:eastAsia="宋体" w:cs="Times New Roman"/>
-                                      <w:b/>
-                                      <w:bCs w:val="0"/>
-                                      <w:color w:val="EA9600"/>
-                                      <w:sz w:val="30"/>
-                                      <w:szCs w:val="22"/>
-                                      <w:lang w:val="en-US" w:eastAsia="zh-CN" w:bidi="ar-SA"/>
-                                    </w:rPr>
-                                    <w:t>License Start Date</w:t>
-                                  </w:r>
-                                  <w:r>
-                                    <w:rPr>
-                                      <w:rFonts w:hint="default" w:ascii="Times New Roman" w:hAnsi="Times New Roman" w:eastAsia="TH Sarabun PSK" w:cs="Times New Roman"/>
-                                      <w:b/>
-                                      <w:bCs/>
-                                      <w:i w:val="0"/>
-                                      <w:iCs w:val="0"/>
-                                      <w:color w:val="BF9000" w:themeColor="accent4" w:themeShade="BF"/>
-                                      <w:kern w:val="0"/>
-                                      <w:sz w:val="32"/>
-                                      <w:szCs w:val="32"/>
-                                      <w:u w:val="none"/>
-                                      <w:lang w:val="en-US" w:eastAsia="zh-CN" w:bidi="ar"/>
-                                    </w:rPr>
-                                    <w:t xml:space="preserve">: </w:t>
-                                  </w:r>
-                                </w:p>
-                              </w:tc>
-                              <w:tc>
-                                <w:tcPr>
-                                  <w:tcW w:w="5749" w:type="dxa"/>
-                                  <w:shd w:val="clear" w:color="auto" w:fill="auto"/>
-                                  <w:noWrap/>
-                                  <w:vAlign w:val="center"/>
-                                </w:tcPr>
-                                <w:p>
-                                  <w:pPr>
-                                    <w:keepNext w:val="0"/>
-                                    <w:keepLines w:val="0"/>
-                                    <w:widowControl/>
-                                    <w:suppressLineNumbers w:val="0"/>
-                                    <w:jc w:val="left"/>
-                                    <w:textAlignment w:val="center"/>
-                                    <w:rPr>
-                                      <w:rFonts w:hint="default" w:ascii="Times New Roman" w:hAnsi="Times New Roman" w:eastAsia="TH Sarabun PSK" w:cs="Times New Roman"/>
-                                      <w:b w:val="0"/>
-                                      <w:bCs w:val="0"/>
-                                      <w:i w:val="0"/>
-                                      <w:iCs w:val="0"/>
-                                      <w:color w:val="FFFFFF" w:themeColor="background1"/>
-                                      <w:sz w:val="28"/>
-                                      <w:szCs w:val="28"/>
-                                      <w:u w:val="none"/>
-                                      <w:lang w:val="en-US"/>
-                                      <w14:textFill>
-                                        <w14:solidFill>
-                                          <w14:schemeClr w14:val="bg1"/>
-                                        </w14:solidFill>
-                                      </w14:textFill>
-                                    </w:rPr>
-                                  </w:pPr>
-                                  <w:r>
-                                    <w:rPr>
-                                      <w:rFonts w:hint="eastAsia" w:ascii="Times New Roman" w:hAnsi="Times New Roman" w:eastAsia="TH Sarabun PSK" w:cs="Times New Roman"/>
-                                      <w:b w:val="0"/>
-                                      <w:bCs w:val="0"/>
-                                      <w:i w:val="0"/>
-                                      <w:iCs w:val="0"/>
-                                      <w:color w:val="FFFFFF" w:themeColor="background1"/>
-                                      <w:kern w:val="0"/>
-                                      <w:sz w:val="28"/>
-                                      <w:szCs w:val="28"/>
-                                      <w:u w:val="none"/>
-                                      <w:lang w:val="en-US" w:eastAsia="zh-CN" w:bidi="ar"/>
-                                      <w14:textFill>
-                                        <w14:solidFill>
-                                          <w14:schemeClr w14:val="bg1"/>
-                                        </w14:solidFill>
-                                      </w14:textFill>
-                                    </w:rPr>
-                                    <w:t>{生效日期, 格式yyyy-mm-dd}</w:t>
                                   </w:r>
                                 </w:p>
                               </w:tc>
@@ -882,6 +633,7 @@
                                       <w:sz w:val="32"/>
                                       <w:szCs w:val="32"/>
                                       <w:u w:val="none"/>
+                                      <w:lang w:val="en-US"/>
                                     </w:rPr>
                                   </w:pPr>
                                   <w:r>
@@ -894,23 +646,7 @@
                                       <w:szCs w:val="22"/>
                                       <w:lang w:val="en-US" w:eastAsia="zh-CN" w:bidi="ar-SA"/>
                                     </w:rPr>
-                                    <w:t>License Expire Date</w:t>
-                                  </w:r>
-                                  <w:r>
-                                    <w:rPr>
-                                      <w:rFonts w:hint="default" w:ascii="Times New Roman" w:hAnsi="Times New Roman" w:eastAsia="TH Sarabun PSK" w:cs="Times New Roman"/>
-                                      <w:b/>
-                                      <w:bCs/>
-                                      <w:i w:val="0"/>
-                                      <w:iCs w:val="0"/>
-                                      <w:color w:val="BF9000" w:themeColor="accent4" w:themeShade="BF"/>
-                                      <w:kern w:val="0"/>
-                                      <w:sz w:val="32"/>
-                                      <w:szCs w:val="32"/>
-                                      <w:u w:val="none"/>
-                                      <w:lang w:val="en-US" w:eastAsia="zh-CN" w:bidi="ar"/>
-                                    </w:rPr>
-                                    <w:t xml:space="preserve">:  </w:t>
+                                    <w:t xml:space="preserve">Licensed Quantity: </w:t>
                                   </w:r>
                                 </w:p>
                               </w:tc>
@@ -930,7 +666,7 @@
                                     <w:jc w:val="left"/>
                                     <w:textAlignment w:val="center"/>
                                     <w:rPr>
-                                      <w:rFonts w:hint="default" w:ascii="Times New Roman" w:hAnsi="Times New Roman" w:eastAsia="TH Sarabun PSK" w:cs="Times New Roman"/>
+                                      <w:rFonts w:hint="default" w:ascii="Times New Roman" w:hAnsi="Times New Roman" w:eastAsia="宋体" w:cs="Times New Roman"/>
                                       <w:b w:val="0"/>
                                       <w:bCs w:val="0"/>
                                       <w:i w:val="0"/>
@@ -939,6 +675,7 @@
                                       <w:sz w:val="28"/>
                                       <w:szCs w:val="28"/>
                                       <w:u w:val="none"/>
+                                      <w:lang w:val="en-US" w:eastAsia="zh-CN"/>
                                       <w14:textFill>
                                         <w14:solidFill>
                                           <w14:schemeClr w14:val="bg1"/>
@@ -948,123 +685,7 @@
                                   </w:pPr>
                                   <w:r>
                                     <w:rPr>
-                                      <w:rFonts w:hint="eastAsia" w:ascii="Times New Roman" w:hAnsi="Times New Roman" w:eastAsia="TH Sarabun PSK" w:cs="Times New Roman"/>
-                                      <w:b w:val="0"/>
-                                      <w:bCs w:val="0"/>
-                                      <w:i w:val="0"/>
-                                      <w:iCs w:val="0"/>
-                                      <w:color w:val="FFFFFF" w:themeColor="background1"/>
-                                      <w:kern w:val="0"/>
-                                      <w:sz w:val="28"/>
-                                      <w:szCs w:val="28"/>
-                                      <w:u w:val="none"/>
-                                      <w:lang w:val="en-US" w:eastAsia="zh-CN" w:bidi="ar"/>
-                                      <w14:textFill>
-                                        <w14:solidFill>
-                                          <w14:schemeClr w14:val="bg1"/>
-                                        </w14:solidFill>
-                                      </w14:textFill>
-                                    </w:rPr>
-                                    <w:t>{结束日期, 格式yyyy-mm-dd}</w:t>
-                                  </w:r>
-                                </w:p>
-                              </w:tc>
-                            </w:tr>
-                            <w:tr>
-                              <w:tblPrEx>
-                                <w:tblBorders>
-                                  <w:top w:val="none" w:color="auto" w:sz="0" w:space="0"/>
-                                  <w:left w:val="none" w:color="auto" w:sz="0" w:space="0"/>
-                                  <w:bottom w:val="none" w:color="auto" w:sz="0" w:space="0"/>
-                                  <w:right w:val="none" w:color="auto" w:sz="0" w:space="0"/>
-                                  <w:insideH w:val="none" w:color="auto" w:sz="0" w:space="0"/>
-                                  <w:insideV w:val="none" w:color="auto" w:sz="0" w:space="0"/>
-                                </w:tblBorders>
-                                <w:tblCellMar>
-                                  <w:top w:w="0" w:type="dxa"/>
-                                  <w:left w:w="108" w:type="dxa"/>
-                                  <w:bottom w:w="0" w:type="dxa"/>
-                                  <w:right w:w="108" w:type="dxa"/>
-                                </w:tblCellMar>
-                              </w:tblPrEx>
-                              <w:trPr>
-                                <w:trHeight w:val="737" w:hRule="exact"/>
-                                <w:jc w:val="center"/>
-                              </w:trPr>
-                              <w:tc>
-                                <w:tcPr>
-                                  <w:tcW w:w="3146" w:type="dxa"/>
-                                  <w:shd w:val="clear" w:color="auto" w:fill="auto"/>
-                                  <w:noWrap/>
-                                  <w:vAlign w:val="center"/>
-                                </w:tcPr>
-                                <w:p>
-                                  <w:pPr>
-                                    <w:keepNext w:val="0"/>
-                                    <w:keepLines w:val="0"/>
-                                    <w:widowControl/>
-                                    <w:suppressLineNumbers w:val="0"/>
-                                    <w:jc w:val="left"/>
-                                    <w:textAlignment w:val="center"/>
-                                    <w:rPr>
-                                      <w:rFonts w:hint="default" w:ascii="Times New Roman" w:hAnsi="Times New Roman" w:eastAsia="TH Sarabun PSK" w:cs="Times New Roman"/>
-                                      <w:b/>
-                                      <w:bCs/>
-                                      <w:i w:val="0"/>
-                                      <w:iCs w:val="0"/>
-                                      <w:color w:val="BF9000" w:themeColor="accent4" w:themeShade="BF"/>
-                                      <w:sz w:val="32"/>
-                                      <w:szCs w:val="32"/>
-                                      <w:u w:val="none"/>
-                                    </w:rPr>
-                                  </w:pPr>
-                                  <w:r>
-                                    <w:rPr>
                                       <w:rFonts w:hint="eastAsia" w:ascii="Times New Roman" w:hAnsi="Times New Roman" w:eastAsia="宋体" w:cs="Times New Roman"/>
-                                      <w:b/>
-                                      <w:bCs w:val="0"/>
-                                      <w:color w:val="EA9600"/>
-                                      <w:sz w:val="30"/>
-                                      <w:szCs w:val="22"/>
-                                      <w:lang w:val="en-US" w:eastAsia="zh-CN" w:bidi="ar-SA"/>
-                                    </w:rPr>
-                                    <w:t>Upgrade Deadline</w:t>
-                                  </w:r>
-                                  <w:r>
-                                    <w:rPr>
-                                      <w:rFonts w:hint="default" w:ascii="Times New Roman" w:hAnsi="Times New Roman" w:eastAsia="TH Sarabun PSK" w:cs="Times New Roman"/>
-                                      <w:b/>
-                                      <w:bCs/>
-                                      <w:i w:val="0"/>
-                                      <w:iCs w:val="0"/>
-                                      <w:color w:val="BF9000" w:themeColor="accent4" w:themeShade="BF"/>
-                                      <w:kern w:val="0"/>
-                                      <w:sz w:val="32"/>
-                                      <w:szCs w:val="32"/>
-                                      <w:u w:val="none"/>
-                                      <w:lang w:val="en-US" w:eastAsia="zh-CN" w:bidi="ar"/>
-                                    </w:rPr>
-                                    <w:t xml:space="preserve">:  </w:t>
-                                  </w:r>
-                                </w:p>
-                              </w:tc>
-                              <w:tc>
-                                <w:tcPr>
-                                  <w:tcW w:w="5749" w:type="dxa"/>
-                                  <w:shd w:val="clear" w:color="auto" w:fill="auto"/>
-                                  <w:noWrap/>
-                                  <w:vAlign w:val="center"/>
-                                </w:tcPr>
-                                <w:p>
-                                  <w:pPr>
-                                    <w:keepNext w:val="0"/>
-                                    <w:keepLines w:val="0"/>
-                                    <w:widowControl/>
-                                    <w:suppressLineNumbers w:val="0"/>
-                                    <w:jc w:val="left"/>
-                                    <w:textAlignment w:val="center"/>
-                                    <w:rPr>
-                                      <w:rFonts w:hint="default" w:ascii="Times New Roman" w:hAnsi="Times New Roman" w:eastAsia="TH Sarabun PSK" w:cs="Times New Roman"/>
                                       <w:b w:val="0"/>
                                       <w:bCs w:val="0"/>
                                       <w:i w:val="0"/>
@@ -1073,34 +694,14 @@
                                       <w:sz w:val="28"/>
                                       <w:szCs w:val="28"/>
                                       <w:u w:val="none"/>
-                                      <w:lang w:val="en-US"/>
+                                      <w:lang w:val="en-US" w:eastAsia="zh-CN"/>
                                       <w14:textFill>
                                         <w14:solidFill>
                                           <w14:schemeClr w14:val="bg1"/>
                                         </w14:solidFill>
                                       </w14:textFill>
                                     </w:rPr>
-                                  </w:pPr>
-                                  <w:r>
-                                    <w:rPr>
-                                      <w:rFonts w:hint="eastAsia" w:ascii="Times New Roman" w:hAnsi="Times New Roman" w:eastAsia="TH Sarabun PSK" w:cs="Times New Roman"/>
-                                      <w:b w:val="0"/>
-                                      <w:bCs w:val="0"/>
-                                      <w:i w:val="0"/>
-                                      <w:iCs w:val="0"/>
-                                      <w:color w:val="FFFFFF" w:themeColor="background1"/>
-                                      <w:kern w:val="0"/>
-                                      <w:sz w:val="28"/>
-                                      <w:szCs w:val="28"/>
-                                      <w:u w:val="none"/>
-                                      <w:lang w:val="en-US" w:eastAsia="zh-CN" w:bidi="ar"/>
-                                      <w14:textFill>
-                                        <w14:solidFill>
-                                          <w14:schemeClr w14:val="bg1"/>
-                                        </w14:solidFill>
-                                      </w14:textFill>
-                                    </w:rPr>
-                                    <w:t>{结束日期, 格式yyyy-mm-dd}</w:t>
+                                    <w:t>{quantity}</w:t>
                                   </w:r>
                                 </w:p>
                               </w:tc>
@@ -1164,7 +765,7 @@
                                       <w:szCs w:val="22"/>
                                       <w:lang w:val="en-US" w:eastAsia="zh-CN" w:bidi="ar-SA"/>
                                     </w:rPr>
-                                    <w:t>License Number</w:t>
+                                    <w:t>License Start Date</w:t>
                                   </w:r>
                                   <w:r>
                                     <w:rPr>
@@ -1236,7 +837,413 @@
                                         </w14:solidFill>
                                       </w14:textFill>
                                     </w:rPr>
-                                    <w:t>{激活码code}</w:t>
+                                    <w:t>{startDate}</w:t>
+                                  </w:r>
+                                </w:p>
+                              </w:tc>
+                            </w:tr>
+                            <w:tr>
+                              <w:tblPrEx>
+                                <w:tblBorders>
+                                  <w:top w:val="none" w:color="auto" w:sz="0" w:space="0"/>
+                                  <w:left w:val="none" w:color="auto" w:sz="0" w:space="0"/>
+                                  <w:bottom w:val="none" w:color="auto" w:sz="0" w:space="0"/>
+                                  <w:right w:val="none" w:color="auto" w:sz="0" w:space="0"/>
+                                  <w:insideH w:val="none" w:color="auto" w:sz="0" w:space="0"/>
+                                  <w:insideV w:val="none" w:color="auto" w:sz="0" w:space="0"/>
+                                </w:tblBorders>
+                                <w:tblCellMar>
+                                  <w:top w:w="0" w:type="dxa"/>
+                                  <w:left w:w="108" w:type="dxa"/>
+                                  <w:bottom w:w="0" w:type="dxa"/>
+                                  <w:right w:w="108" w:type="dxa"/>
+                                </w:tblCellMar>
+                              </w:tblPrEx>
+                              <w:trPr>
+                                <w:trHeight w:val="737" w:hRule="exact"/>
+                                <w:jc w:val="center"/>
+                              </w:trPr>
+                              <w:tc>
+                                <w:tcPr>
+                                  <w:tcW w:w="3146" w:type="dxa"/>
+                                  <w:shd w:val="clear" w:color="auto" w:fill="auto"/>
+                                  <w:noWrap/>
+                                  <w:vAlign w:val="center"/>
+                                </w:tcPr>
+                                <w:p>
+                                  <w:pPr>
+                                    <w:keepNext w:val="0"/>
+                                    <w:keepLines w:val="0"/>
+                                    <w:widowControl/>
+                                    <w:suppressLineNumbers w:val="0"/>
+                                    <w:jc w:val="left"/>
+                                    <w:textAlignment w:val="center"/>
+                                    <w:rPr>
+                                      <w:rFonts w:hint="default" w:ascii="Times New Roman" w:hAnsi="Times New Roman" w:eastAsia="TH Sarabun PSK" w:cs="Times New Roman"/>
+                                      <w:b/>
+                                      <w:bCs/>
+                                      <w:i w:val="0"/>
+                                      <w:iCs w:val="0"/>
+                                      <w:color w:val="BF9000" w:themeColor="accent4" w:themeShade="BF"/>
+                                      <w:sz w:val="32"/>
+                                      <w:szCs w:val="32"/>
+                                      <w:u w:val="none"/>
+                                    </w:rPr>
+                                  </w:pPr>
+                                  <w:r>
+                                    <w:rPr>
+                                      <w:rFonts w:hint="eastAsia" w:ascii="Times New Roman" w:hAnsi="Times New Roman" w:eastAsia="宋体" w:cs="Times New Roman"/>
+                                      <w:b/>
+                                      <w:bCs w:val="0"/>
+                                      <w:color w:val="EA9600"/>
+                                      <w:sz w:val="30"/>
+                                      <w:szCs w:val="22"/>
+                                      <w:lang w:val="en-US" w:eastAsia="zh-CN" w:bidi="ar-SA"/>
+                                    </w:rPr>
+                                    <w:t>License Expire Date</w:t>
+                                  </w:r>
+                                  <w:r>
+                                    <w:rPr>
+                                      <w:rFonts w:hint="default" w:ascii="Times New Roman" w:hAnsi="Times New Roman" w:eastAsia="TH Sarabun PSK" w:cs="Times New Roman"/>
+                                      <w:b/>
+                                      <w:bCs/>
+                                      <w:i w:val="0"/>
+                                      <w:iCs w:val="0"/>
+                                      <w:color w:val="BF9000" w:themeColor="accent4" w:themeShade="BF"/>
+                                      <w:kern w:val="0"/>
+                                      <w:sz w:val="32"/>
+                                      <w:szCs w:val="32"/>
+                                      <w:u w:val="none"/>
+                                      <w:lang w:val="en-US" w:eastAsia="zh-CN" w:bidi="ar"/>
+                                    </w:rPr>
+                                    <w:t xml:space="preserve">:  </w:t>
+                                  </w:r>
+                                </w:p>
+                              </w:tc>
+                              <w:tc>
+                                <w:tcPr>
+                                  <w:tcW w:w="5749" w:type="dxa"/>
+                                  <w:shd w:val="clear" w:color="auto" w:fill="auto"/>
+                                  <w:noWrap/>
+                                  <w:vAlign w:val="center"/>
+                                </w:tcPr>
+                                <w:p>
+                                  <w:pPr>
+                                    <w:keepNext w:val="0"/>
+                                    <w:keepLines w:val="0"/>
+                                    <w:widowControl/>
+                                    <w:suppressLineNumbers w:val="0"/>
+                                    <w:jc w:val="left"/>
+                                    <w:textAlignment w:val="center"/>
+                                    <w:rPr>
+                                      <w:rFonts w:hint="default" w:ascii="Times New Roman" w:hAnsi="Times New Roman" w:eastAsia="TH Sarabun PSK" w:cs="Times New Roman"/>
+                                      <w:b w:val="0"/>
+                                      <w:bCs w:val="0"/>
+                                      <w:i w:val="0"/>
+                                      <w:iCs w:val="0"/>
+                                      <w:color w:val="FFFFFF" w:themeColor="background1"/>
+                                      <w:sz w:val="28"/>
+                                      <w:szCs w:val="28"/>
+                                      <w:u w:val="none"/>
+                                      <w14:textFill>
+                                        <w14:solidFill>
+                                          <w14:schemeClr w14:val="bg1"/>
+                                        </w14:solidFill>
+                                      </w14:textFill>
+                                    </w:rPr>
+                                  </w:pPr>
+                                  <w:r>
+                                    <w:rPr>
+                                      <w:rFonts w:hint="eastAsia" w:ascii="Times New Roman" w:hAnsi="Times New Roman" w:eastAsia="TH Sarabun PSK" w:cs="Times New Roman"/>
+                                      <w:b w:val="0"/>
+                                      <w:bCs w:val="0"/>
+                                      <w:i w:val="0"/>
+                                      <w:iCs w:val="0"/>
+                                      <w:color w:val="FFFFFF" w:themeColor="background1"/>
+                                      <w:kern w:val="0"/>
+                                      <w:sz w:val="28"/>
+                                      <w:szCs w:val="28"/>
+                                      <w:u w:val="none"/>
+                                      <w:lang w:val="en-US" w:eastAsia="zh-CN" w:bidi="ar"/>
+                                      <w14:textFill>
+                                        <w14:solidFill>
+                                          <w14:schemeClr w14:val="bg1"/>
+                                        </w14:solidFill>
+                                      </w14:textFill>
+                                    </w:rPr>
+                                    <w:t>{endDate}</w:t>
+                                  </w:r>
+                                </w:p>
+                              </w:tc>
+                            </w:tr>
+                            <w:tr>
+                              <w:tblPrEx>
+                                <w:tblBorders>
+                                  <w:top w:val="none" w:color="auto" w:sz="0" w:space="0"/>
+                                  <w:left w:val="none" w:color="auto" w:sz="0" w:space="0"/>
+                                  <w:bottom w:val="none" w:color="auto" w:sz="0" w:space="0"/>
+                                  <w:right w:val="none" w:color="auto" w:sz="0" w:space="0"/>
+                                  <w:insideH w:val="none" w:color="auto" w:sz="0" w:space="0"/>
+                                  <w:insideV w:val="none" w:color="auto" w:sz="0" w:space="0"/>
+                                </w:tblBorders>
+                                <w:shd w:val="clear" w:color="auto" w:fill="auto"/>
+                                <w:tblCellMar>
+                                  <w:top w:w="0" w:type="dxa"/>
+                                  <w:left w:w="108" w:type="dxa"/>
+                                  <w:bottom w:w="0" w:type="dxa"/>
+                                  <w:right w:w="108" w:type="dxa"/>
+                                </w:tblCellMar>
+                              </w:tblPrEx>
+                              <w:trPr>
+                                <w:trHeight w:val="737" w:hRule="exact"/>
+                                <w:jc w:val="center"/>
+                              </w:trPr>
+                              <w:tc>
+                                <w:tcPr>
+                                  <w:tcW w:w="3146" w:type="dxa"/>
+                                  <w:shd w:val="clear" w:color="auto" w:fill="auto"/>
+                                  <w:noWrap/>
+                                  <w:vAlign w:val="center"/>
+                                </w:tcPr>
+                                <w:p>
+                                  <w:pPr>
+                                    <w:keepNext w:val="0"/>
+                                    <w:keepLines w:val="0"/>
+                                    <w:widowControl/>
+                                    <w:suppressLineNumbers w:val="0"/>
+                                    <w:jc w:val="left"/>
+                                    <w:textAlignment w:val="center"/>
+                                    <w:rPr>
+                                      <w:rFonts w:hint="default" w:ascii="Times New Roman" w:hAnsi="Times New Roman" w:eastAsia="TH Sarabun PSK" w:cs="Times New Roman"/>
+                                      <w:b/>
+                                      <w:bCs/>
+                                      <w:i w:val="0"/>
+                                      <w:iCs w:val="0"/>
+                                      <w:color w:val="BF9000" w:themeColor="accent4" w:themeShade="BF"/>
+                                      <w:sz w:val="32"/>
+                                      <w:szCs w:val="32"/>
+                                      <w:u w:val="none"/>
+                                    </w:rPr>
+                                  </w:pPr>
+                                  <w:r>
+                                    <w:rPr>
+                                      <w:rFonts w:hint="eastAsia" w:ascii="Times New Roman" w:hAnsi="Times New Roman" w:eastAsia="宋体" w:cs="Times New Roman"/>
+                                      <w:b/>
+                                      <w:bCs w:val="0"/>
+                                      <w:color w:val="EA9600"/>
+                                      <w:sz w:val="30"/>
+                                      <w:szCs w:val="22"/>
+                                      <w:lang w:val="en-US" w:eastAsia="zh-CN" w:bidi="ar-SA"/>
+                                    </w:rPr>
+                                    <w:t>Upgrade Deadline</w:t>
+                                  </w:r>
+                                  <w:r>
+                                    <w:rPr>
+                                      <w:rFonts w:hint="default" w:ascii="Times New Roman" w:hAnsi="Times New Roman" w:eastAsia="TH Sarabun PSK" w:cs="Times New Roman"/>
+                                      <w:b/>
+                                      <w:bCs/>
+                                      <w:i w:val="0"/>
+                                      <w:iCs w:val="0"/>
+                                      <w:color w:val="BF9000" w:themeColor="accent4" w:themeShade="BF"/>
+                                      <w:kern w:val="0"/>
+                                      <w:sz w:val="32"/>
+                                      <w:szCs w:val="32"/>
+                                      <w:u w:val="none"/>
+                                      <w:lang w:val="en-US" w:eastAsia="zh-CN" w:bidi="ar"/>
+                                    </w:rPr>
+                                    <w:t xml:space="preserve">:  </w:t>
+                                  </w:r>
+                                </w:p>
+                              </w:tc>
+                              <w:tc>
+                                <w:tcPr>
+                                  <w:tcW w:w="5749" w:type="dxa"/>
+                                  <w:shd w:val="clear" w:color="auto" w:fill="auto"/>
+                                  <w:noWrap/>
+                                  <w:vAlign w:val="center"/>
+                                </w:tcPr>
+                                <w:p>
+                                  <w:pPr>
+                                    <w:keepNext w:val="0"/>
+                                    <w:keepLines w:val="0"/>
+                                    <w:widowControl/>
+                                    <w:suppressLineNumbers w:val="0"/>
+                                    <w:jc w:val="left"/>
+                                    <w:textAlignment w:val="center"/>
+                                    <w:rPr>
+                                      <w:rFonts w:hint="default" w:ascii="Times New Roman" w:hAnsi="Times New Roman" w:eastAsia="TH Sarabun PSK" w:cs="Times New Roman"/>
+                                      <w:b w:val="0"/>
+                                      <w:bCs w:val="0"/>
+                                      <w:i w:val="0"/>
+                                      <w:iCs w:val="0"/>
+                                      <w:color w:val="FFFFFF" w:themeColor="background1"/>
+                                      <w:sz w:val="28"/>
+                                      <w:szCs w:val="28"/>
+                                      <w:u w:val="none"/>
+                                      <w:lang w:val="en-US"/>
+                                      <w14:textFill>
+                                        <w14:solidFill>
+                                          <w14:schemeClr w14:val="bg1"/>
+                                        </w14:solidFill>
+                                      </w14:textFill>
+                                    </w:rPr>
+                                  </w:pPr>
+                                  <w:r>
+                                    <w:rPr>
+                                      <w:rFonts w:hint="eastAsia" w:ascii="Times New Roman" w:hAnsi="Times New Roman" w:eastAsia="TH Sarabun PSK" w:cs="Times New Roman"/>
+                                      <w:b w:val="0"/>
+                                      <w:bCs w:val="0"/>
+                                      <w:i w:val="0"/>
+                                      <w:iCs w:val="0"/>
+                                      <w:color w:val="FFFFFF" w:themeColor="background1"/>
+                                      <w:kern w:val="0"/>
+                                      <w:sz w:val="28"/>
+                                      <w:szCs w:val="28"/>
+                                      <w:u w:val="none"/>
+                                      <w:lang w:val="en-US" w:eastAsia="zh-CN" w:bidi="ar"/>
+                                      <w14:textFill>
+                                        <w14:solidFill>
+                                          <w14:schemeClr w14:val="bg1"/>
+                                        </w14:solidFill>
+                                      </w14:textFill>
+                                    </w:rPr>
+                                    <w:t>{endDate}</w:t>
+                                  </w:r>
+                                </w:p>
+                              </w:tc>
+                            </w:tr>
+                            <w:tr>
+                              <w:tblPrEx>
+                                <w:tblBorders>
+                                  <w:top w:val="none" w:color="auto" w:sz="0" w:space="0"/>
+                                  <w:left w:val="none" w:color="auto" w:sz="0" w:space="0"/>
+                                  <w:bottom w:val="none" w:color="auto" w:sz="0" w:space="0"/>
+                                  <w:right w:val="none" w:color="auto" w:sz="0" w:space="0"/>
+                                  <w:insideH w:val="none" w:color="auto" w:sz="0" w:space="0"/>
+                                  <w:insideV w:val="none" w:color="auto" w:sz="0" w:space="0"/>
+                                </w:tblBorders>
+                                <w:shd w:val="clear" w:color="auto" w:fill="auto"/>
+                                <w:tblCellMar>
+                                  <w:top w:w="0" w:type="dxa"/>
+                                  <w:left w:w="108" w:type="dxa"/>
+                                  <w:bottom w:w="0" w:type="dxa"/>
+                                  <w:right w:w="108" w:type="dxa"/>
+                                </w:tblCellMar>
+                              </w:tblPrEx>
+                              <w:trPr>
+                                <w:trHeight w:val="737" w:hRule="exact"/>
+                                <w:jc w:val="center"/>
+                              </w:trPr>
+                              <w:tc>
+                                <w:tcPr>
+                                  <w:tcW w:w="3146" w:type="dxa"/>
+                                  <w:shd w:val="clear" w:color="auto" w:fill="auto"/>
+                                  <w:noWrap/>
+                                  <w:vAlign w:val="center"/>
+                                </w:tcPr>
+                                <w:p>
+                                  <w:pPr>
+                                    <w:keepNext w:val="0"/>
+                                    <w:keepLines w:val="0"/>
+                                    <w:widowControl/>
+                                    <w:suppressLineNumbers w:val="0"/>
+                                    <w:jc w:val="left"/>
+                                    <w:textAlignment w:val="center"/>
+                                    <w:rPr>
+                                      <w:rFonts w:hint="default" w:ascii="Times New Roman" w:hAnsi="Times New Roman" w:eastAsia="TH Sarabun PSK" w:cs="Times New Roman"/>
+                                      <w:b/>
+                                      <w:bCs/>
+                                      <w:i w:val="0"/>
+                                      <w:iCs w:val="0"/>
+                                      <w:color w:val="BF9000" w:themeColor="accent4" w:themeShade="BF"/>
+                                      <w:sz w:val="32"/>
+                                      <w:szCs w:val="32"/>
+                                      <w:u w:val="none"/>
+                                    </w:rPr>
+                                  </w:pPr>
+                                  <w:r>
+                                    <w:rPr>
+                                      <w:rFonts w:hint="eastAsia" w:ascii="Times New Roman" w:hAnsi="Times New Roman" w:eastAsia="宋体" w:cs="Times New Roman"/>
+                                      <w:b/>
+                                      <w:bCs w:val="0"/>
+                                      <w:color w:val="EA9600"/>
+                                      <w:sz w:val="30"/>
+                                      <w:szCs w:val="22"/>
+                                      <w:lang w:val="en-US" w:eastAsia="zh-CN" w:bidi="ar-SA"/>
+                                    </w:rPr>
+                                    <w:t>License Number</w:t>
+                                  </w:r>
+                                  <w:r>
+                                    <w:rPr>
+                                      <w:rFonts w:hint="default" w:ascii="Times New Roman" w:hAnsi="Times New Roman" w:eastAsia="TH Sarabun PSK" w:cs="Times New Roman"/>
+                                      <w:b/>
+                                      <w:bCs/>
+                                      <w:i w:val="0"/>
+                                      <w:iCs w:val="0"/>
+                                      <w:color w:val="BF9000" w:themeColor="accent4" w:themeShade="BF"/>
+                                      <w:kern w:val="0"/>
+                                      <w:sz w:val="32"/>
+                                      <w:szCs w:val="32"/>
+                                      <w:u w:val="none"/>
+                                      <w:lang w:val="en-US" w:eastAsia="zh-CN" w:bidi="ar"/>
+                                    </w:rPr>
+                                    <w:t xml:space="preserve">: </w:t>
+                                  </w:r>
+                                </w:p>
+                              </w:tc>
+                              <w:tc>
+                                <w:tcPr>
+                                  <w:tcW w:w="5749" w:type="dxa"/>
+                                  <w:shd w:val="clear" w:color="auto" w:fill="auto"/>
+                                  <w:noWrap/>
+                                  <w:vAlign w:val="center"/>
+                                </w:tcPr>
+                                <w:p>
+                                  <w:pPr>
+                                    <w:keepNext w:val="0"/>
+                                    <w:keepLines w:val="0"/>
+                                    <w:widowControl/>
+                                    <w:suppressLineNumbers w:val="0"/>
+                                    <w:jc w:val="left"/>
+                                    <w:textAlignment w:val="center"/>
+                                    <w:rPr>
+                                      <w:rFonts w:hint="default" w:ascii="Times New Roman" w:hAnsi="Times New Roman" w:eastAsia="TH Sarabun PSK" w:cs="Times New Roman"/>
+                                      <w:b w:val="0"/>
+                                      <w:bCs w:val="0"/>
+                                      <w:i w:val="0"/>
+                                      <w:iCs w:val="0"/>
+                                      <w:color w:val="FFFFFF" w:themeColor="background1"/>
+                                      <w:sz w:val="28"/>
+                                      <w:szCs w:val="28"/>
+                                      <w:u w:val="none"/>
+                                      <w:lang w:val="en-US"/>
+                                      <w14:textFill>
+                                        <w14:solidFill>
+                                          <w14:schemeClr w14:val="bg1"/>
+                                        </w14:solidFill>
+                                      </w14:textFill>
+                                    </w:rPr>
+                                  </w:pPr>
+                                  <w:r>
+                                    <w:rPr>
+                                      <w:rFonts w:hint="eastAsia" w:ascii="Times New Roman" w:hAnsi="Times New Roman" w:eastAsia="TH Sarabun PSK" w:cs="Times New Roman"/>
+                                      <w:b w:val="0"/>
+                                      <w:bCs w:val="0"/>
+                                      <w:i w:val="0"/>
+                                      <w:iCs w:val="0"/>
+                                      <w:color w:val="FFFFFF" w:themeColor="background1"/>
+                                      <w:kern w:val="0"/>
+                                      <w:sz w:val="28"/>
+                                      <w:szCs w:val="28"/>
+                                      <w:u w:val="none"/>
+                                      <w:lang w:val="en-US" w:eastAsia="zh-CN" w:bidi="ar"/>
+                                      <w14:textFill>
+                                        <w14:solidFill>
+                                          <w14:schemeClr w14:val="bg1"/>
+                                        </w14:solidFill>
+                                      </w14:textFill>
+                                    </w:rPr>
+                                    <w:t>{activationCode}</w:t>
                                   </w:r>
                                 </w:p>
                               </w:tc>
@@ -1318,7 +1325,7 @@
                             </w14:solidFill>
                           </w14:textFill>
                         </w:rPr>
-                        <w:t>{客户名称}</w:t>
+                        <w:t>{clientName}</w:t>
                       </w:r>
                     </w:p>
                     <w:p>
@@ -1782,7 +1789,7 @@
                                   </w14:solidFill>
                                 </w14:textFill>
                               </w:rPr>
-                              <w:t>{数量}</w:t>
+                              <w:t>{quantity}</w:t>
                             </w:r>
                           </w:p>
                         </w:tc>
@@ -1917,7 +1924,7 @@
                                   </w14:solidFill>
                                 </w14:textFill>
                               </w:rPr>
-                              <w:t>{生效日期, 格式yyyy-mm-dd}</w:t>
+                              <w:t>{startDate}</w:t>
                             </w:r>
                           </w:p>
                         </w:tc>
@@ -2051,143 +2058,7 @@
                                   </w14:solidFill>
                                 </w14:textFill>
                               </w:rPr>
-                              <w:t>{结束日期, 格式yyyy-mm-dd}</w:t>
-                            </w:r>
-                          </w:p>
-                        </w:tc>
-                      </w:tr>
-                      <w:tr>
-                        <w:tblPrEx>
-                          <w:tblBorders>
-                            <w:top w:val="none" w:color="auto" w:sz="0" w:space="0"/>
-                            <w:left w:val="none" w:color="auto" w:sz="0" w:space="0"/>
-                            <w:bottom w:val="none" w:color="auto" w:sz="0" w:space="0"/>
-                            <w:right w:val="none" w:color="auto" w:sz="0" w:space="0"/>
-                            <w:insideH w:val="none" w:color="auto" w:sz="0" w:space="0"/>
-                            <w:insideV w:val="none" w:color="auto" w:sz="0" w:space="0"/>
-                          </w:tblBorders>
-                          <w:shd w:val="clear" w:color="auto" w:fill="auto"/>
-                          <w:tblCellMar>
-                            <w:top w:w="0" w:type="dxa"/>
-                            <w:left w:w="108" w:type="dxa"/>
-                            <w:bottom w:w="0" w:type="dxa"/>
-                            <w:right w:w="108" w:type="dxa"/>
-                          </w:tblCellMar>
-                        </w:tblPrEx>
-                        <w:trPr>
-                          <w:trHeight w:val="737" w:hRule="exact"/>
-                          <w:jc w:val="center"/>
-                        </w:trPr>
-                        <w:tc>
-                          <w:tcPr>
-                            <w:tcW w:w="3146" w:type="dxa"/>
-                            <w:shd w:val="clear" w:color="auto" w:fill="auto"/>
-                            <w:noWrap/>
-                            <w:vAlign w:val="center"/>
-                          </w:tcPr>
-                          <w:p>
-                            <w:pPr>
-                              <w:keepNext w:val="0"/>
-                              <w:keepLines w:val="0"/>
-                              <w:widowControl/>
-                              <w:suppressLineNumbers w:val="0"/>
-                              <w:jc w:val="left"/>
-                              <w:textAlignment w:val="center"/>
-                              <w:rPr>
-                                <w:rFonts w:hint="default" w:ascii="Times New Roman" w:hAnsi="Times New Roman" w:eastAsia="TH Sarabun PSK" w:cs="Times New Roman"/>
-                                <w:b/>
-                                <w:bCs/>
-                                <w:i w:val="0"/>
-                                <w:iCs w:val="0"/>
-                                <w:color w:val="BF9000" w:themeColor="accent4" w:themeShade="BF"/>
-                                <w:sz w:val="32"/>
-                                <w:szCs w:val="32"/>
-                                <w:u w:val="none"/>
-                              </w:rPr>
-                            </w:pPr>
-                            <w:r>
-                              <w:rPr>
-                                <w:rFonts w:hint="eastAsia" w:ascii="Times New Roman" w:hAnsi="Times New Roman" w:eastAsia="宋体" w:cs="Times New Roman"/>
-                                <w:b/>
-                                <w:bCs w:val="0"/>
-                                <w:color w:val="EA9600"/>
-                                <w:sz w:val="30"/>
-                                <w:szCs w:val="22"/>
-                                <w:lang w:val="en-US" w:eastAsia="zh-CN" w:bidi="ar-SA"/>
-                              </w:rPr>
-                              <w:t>Upgrade Deadline</w:t>
-                            </w:r>
-                            <w:r>
-                              <w:rPr>
-                                <w:rFonts w:hint="default" w:ascii="Times New Roman" w:hAnsi="Times New Roman" w:eastAsia="TH Sarabun PSK" w:cs="Times New Roman"/>
-                                <w:b/>
-                                <w:bCs/>
-                                <w:i w:val="0"/>
-                                <w:iCs w:val="0"/>
-                                <w:color w:val="BF9000" w:themeColor="accent4" w:themeShade="BF"/>
-                                <w:kern w:val="0"/>
-                                <w:sz w:val="32"/>
-                                <w:szCs w:val="32"/>
-                                <w:u w:val="none"/>
-                                <w:lang w:val="en-US" w:eastAsia="zh-CN" w:bidi="ar"/>
-                              </w:rPr>
-                              <w:t xml:space="preserve">:  </w:t>
-                            </w:r>
-                          </w:p>
-                        </w:tc>
-                        <w:tc>
-                          <w:tcPr>
-                            <w:tcW w:w="5749" w:type="dxa"/>
-                            <w:shd w:val="clear" w:color="auto" w:fill="auto"/>
-                            <w:noWrap/>
-                            <w:vAlign w:val="center"/>
-                          </w:tcPr>
-                          <w:p>
-                            <w:pPr>
-                              <w:keepNext w:val="0"/>
-                              <w:keepLines w:val="0"/>
-                              <w:widowControl/>
-                              <w:suppressLineNumbers w:val="0"/>
-                              <w:jc w:val="left"/>
-                              <w:textAlignment w:val="center"/>
-                              <w:rPr>
-                                <w:rFonts w:hint="default" w:ascii="Times New Roman" w:hAnsi="Times New Roman" w:eastAsia="TH Sarabun PSK" w:cs="Times New Roman"/>
-                                <w:b w:val="0"/>
-                                <w:bCs w:val="0"/>
-                                <w:i w:val="0"/>
-                                <w:iCs w:val="0"/>
-                                <w:color w:val="FFFFFF" w:themeColor="background1"/>
-                                <w:sz w:val="28"/>
-                                <w:szCs w:val="28"/>
-                                <w:u w:val="none"/>
-                                <w:lang w:val="en-US"/>
-                                <w14:textFill>
-                                  <w14:solidFill>
-                                    <w14:schemeClr w14:val="bg1"/>
-                                  </w14:solidFill>
-                                </w14:textFill>
-                              </w:rPr>
-                            </w:pPr>
-                            <w:r>
-                              <w:rPr>
-                                <w:rFonts w:hint="eastAsia" w:ascii="Times New Roman" w:hAnsi="Times New Roman" w:eastAsia="TH Sarabun PSK" w:cs="Times New Roman"/>
-                                <w:b w:val="0"/>
-                                <w:bCs w:val="0"/>
-                                <w:i w:val="0"/>
-                                <w:iCs w:val="0"/>
-                                <w:color w:val="FFFFFF" w:themeColor="background1"/>
-                                <w:kern w:val="0"/>
-                                <w:sz w:val="28"/>
-                                <w:szCs w:val="28"/>
-                                <w:u w:val="none"/>
-                                <w:lang w:val="en-US" w:eastAsia="zh-CN" w:bidi="ar"/>
-                                <w14:textFill>
-                                  <w14:solidFill>
-                                    <w14:schemeClr w14:val="bg1"/>
-                                  </w14:solidFill>
-                                </w14:textFill>
-                              </w:rPr>
-                              <w:t>{结束日期, 格式yyyy-mm-dd}</w:t>
+                              <w:t>{endDate}</w:t>
                             </w:r>
                           </w:p>
                         </w:tc>
@@ -2250,6 +2121,141 @@
                                 <w:szCs w:val="22"/>
                                 <w:lang w:val="en-US" w:eastAsia="zh-CN" w:bidi="ar-SA"/>
                               </w:rPr>
+                              <w:t>Upgrade Deadline</w:t>
+                            </w:r>
+                            <w:r>
+                              <w:rPr>
+                                <w:rFonts w:hint="default" w:ascii="Times New Roman" w:hAnsi="Times New Roman" w:eastAsia="TH Sarabun PSK" w:cs="Times New Roman"/>
+                                <w:b/>
+                                <w:bCs/>
+                                <w:i w:val="0"/>
+                                <w:iCs w:val="0"/>
+                                <w:color w:val="BF9000" w:themeColor="accent4" w:themeShade="BF"/>
+                                <w:kern w:val="0"/>
+                                <w:sz w:val="32"/>
+                                <w:szCs w:val="32"/>
+                                <w:u w:val="none"/>
+                                <w:lang w:val="en-US" w:eastAsia="zh-CN" w:bidi="ar"/>
+                              </w:rPr>
+                              <w:t xml:space="preserve">:  </w:t>
+                            </w:r>
+                          </w:p>
+                        </w:tc>
+                        <w:tc>
+                          <w:tcPr>
+                            <w:tcW w:w="5749" w:type="dxa"/>
+                            <w:shd w:val="clear" w:color="auto" w:fill="auto"/>
+                            <w:noWrap/>
+                            <w:vAlign w:val="center"/>
+                          </w:tcPr>
+                          <w:p>
+                            <w:pPr>
+                              <w:keepNext w:val="0"/>
+                              <w:keepLines w:val="0"/>
+                              <w:widowControl/>
+                              <w:suppressLineNumbers w:val="0"/>
+                              <w:jc w:val="left"/>
+                              <w:textAlignment w:val="center"/>
+                              <w:rPr>
+                                <w:rFonts w:hint="default" w:ascii="Times New Roman" w:hAnsi="Times New Roman" w:eastAsia="TH Sarabun PSK" w:cs="Times New Roman"/>
+                                <w:b w:val="0"/>
+                                <w:bCs w:val="0"/>
+                                <w:i w:val="0"/>
+                                <w:iCs w:val="0"/>
+                                <w:color w:val="FFFFFF" w:themeColor="background1"/>
+                                <w:sz w:val="28"/>
+                                <w:szCs w:val="28"/>
+                                <w:u w:val="none"/>
+                                <w:lang w:val="en-US"/>
+                                <w14:textFill>
+                                  <w14:solidFill>
+                                    <w14:schemeClr w14:val="bg1"/>
+                                  </w14:solidFill>
+                                </w14:textFill>
+                              </w:rPr>
+                            </w:pPr>
+                            <w:r>
+                              <w:rPr>
+                                <w:rFonts w:hint="eastAsia" w:ascii="Times New Roman" w:hAnsi="Times New Roman" w:eastAsia="TH Sarabun PSK" w:cs="Times New Roman"/>
+                                <w:b w:val="0"/>
+                                <w:bCs w:val="0"/>
+                                <w:i w:val="0"/>
+                                <w:iCs w:val="0"/>
+                                <w:color w:val="FFFFFF" w:themeColor="background1"/>
+                                <w:kern w:val="0"/>
+                                <w:sz w:val="28"/>
+                                <w:szCs w:val="28"/>
+                                <w:u w:val="none"/>
+                                <w:lang w:val="en-US" w:eastAsia="zh-CN" w:bidi="ar"/>
+                                <w14:textFill>
+                                  <w14:solidFill>
+                                    <w14:schemeClr w14:val="bg1"/>
+                                  </w14:solidFill>
+                                </w14:textFill>
+                              </w:rPr>
+                              <w:t>{endDate}</w:t>
+                            </w:r>
+                          </w:p>
+                        </w:tc>
+                      </w:tr>
+                      <w:tr>
+                        <w:tblPrEx>
+                          <w:tblBorders>
+                            <w:top w:val="none" w:color="auto" w:sz="0" w:space="0"/>
+                            <w:left w:val="none" w:color="auto" w:sz="0" w:space="0"/>
+                            <w:bottom w:val="none" w:color="auto" w:sz="0" w:space="0"/>
+                            <w:right w:val="none" w:color="auto" w:sz="0" w:space="0"/>
+                            <w:insideH w:val="none" w:color="auto" w:sz="0" w:space="0"/>
+                            <w:insideV w:val="none" w:color="auto" w:sz="0" w:space="0"/>
+                          </w:tblBorders>
+                          <w:tblCellMar>
+                            <w:top w:w="0" w:type="dxa"/>
+                            <w:left w:w="108" w:type="dxa"/>
+                            <w:bottom w:w="0" w:type="dxa"/>
+                            <w:right w:w="108" w:type="dxa"/>
+                          </w:tblCellMar>
+                        </w:tblPrEx>
+                        <w:trPr>
+                          <w:trHeight w:val="737" w:hRule="exact"/>
+                          <w:jc w:val="center"/>
+                        </w:trPr>
+                        <w:tc>
+                          <w:tcPr>
+                            <w:tcW w:w="3146" w:type="dxa"/>
+                            <w:shd w:val="clear" w:color="auto" w:fill="auto"/>
+                            <w:noWrap/>
+                            <w:vAlign w:val="center"/>
+                          </w:tcPr>
+                          <w:p>
+                            <w:pPr>
+                              <w:keepNext w:val="0"/>
+                              <w:keepLines w:val="0"/>
+                              <w:widowControl/>
+                              <w:suppressLineNumbers w:val="0"/>
+                              <w:jc w:val="left"/>
+                              <w:textAlignment w:val="center"/>
+                              <w:rPr>
+                                <w:rFonts w:hint="default" w:ascii="Times New Roman" w:hAnsi="Times New Roman" w:eastAsia="TH Sarabun PSK" w:cs="Times New Roman"/>
+                                <w:b/>
+                                <w:bCs/>
+                                <w:i w:val="0"/>
+                                <w:iCs w:val="0"/>
+                                <w:color w:val="BF9000" w:themeColor="accent4" w:themeShade="BF"/>
+                                <w:sz w:val="32"/>
+                                <w:szCs w:val="32"/>
+                                <w:u w:val="none"/>
+                              </w:rPr>
+                            </w:pPr>
+                            <w:r>
+                              <w:rPr>
+                                <w:rFonts w:hint="eastAsia" w:ascii="Times New Roman" w:hAnsi="Times New Roman" w:eastAsia="宋体" w:cs="Times New Roman"/>
+                                <w:b/>
+                                <w:bCs w:val="0"/>
+                                <w:color w:val="EA9600"/>
+                                <w:sz w:val="30"/>
+                                <w:szCs w:val="22"/>
+                                <w:lang w:val="en-US" w:eastAsia="zh-CN" w:bidi="ar-SA"/>
+                              </w:rPr>
                               <w:t>License Number</w:t>
                             </w:r>
                             <w:r>
@@ -2322,7 +2328,7 @@
                                   </w14:solidFill>
                                 </w14:textFill>
                               </w:rPr>
-                              <w:t>{激活码code}</w:t>
+                              <w:t>{activationCode}</w:t>
                             </w:r>
                           </w:p>
                         </w:tc>

</xml_diff>